<commit_message>
feat: added notes and a comment
</commit_message>
<xml_diff>
--- a/assets/Notes.docx
+++ b/assets/Notes.docx
@@ -6,26 +6,68 @@
       <w:pPr>
         <w:jc w:val="center"/>
         <w:rPr>
-          <w:color w:val="156082" w:themeColor="accent1"/>
-          <w:sz w:val="40"/>
-          <w:szCs w:val="40"/>
-        </w:rPr>
-      </w:pPr>
-      <w:r>
-        <w:rPr>
-          <w:color w:val="156082" w:themeColor="accent1"/>
-          <w:sz w:val="40"/>
-          <w:szCs w:val="40"/>
-        </w:rPr>
-        <w:t xml:space="preserve">Personal </w:t>
-      </w:r>
-      <w:r>
-        <w:rPr>
-          <w:color w:val="156082" w:themeColor="accent1"/>
-          <w:sz w:val="40"/>
-          <w:szCs w:val="40"/>
+          <w:color w:val="0F4761" w:themeColor="accent1" w:themeShade="BF"/>
+          <w:sz w:val="32"/>
+          <w:szCs w:val="32"/>
+        </w:rPr>
+      </w:pPr>
+      <w:r>
+        <w:rPr>
+          <w:b/>
+          <w:bCs/>
+          <w:color w:val="0F4761" w:themeColor="accent1" w:themeShade="BF"/>
+          <w:sz w:val="32"/>
+          <w:szCs w:val="32"/>
         </w:rPr>
         <w:t>Notes</w:t>
+      </w:r>
+      <w:r>
+        <w:rPr>
+          <w:color w:val="0F4761" w:themeColor="accent1" w:themeShade="BF"/>
+          <w:sz w:val="32"/>
+          <w:szCs w:val="32"/>
+        </w:rPr>
+        <w:t xml:space="preserve"> </w:t>
+      </w:r>
+      <w:r>
+        <w:rPr>
+          <w:i/>
+          <w:iCs/>
+          <w:color w:val="0F4761" w:themeColor="accent1" w:themeShade="BF"/>
+          <w:sz w:val="32"/>
+          <w:szCs w:val="32"/>
+        </w:rPr>
+        <w:t>(</w:t>
+      </w:r>
+      <w:r>
+        <w:rPr>
+          <w:i/>
+          <w:iCs/>
+          <w:color w:val="0F4761" w:themeColor="accent1" w:themeShade="BF"/>
+          <w:sz w:val="32"/>
+          <w:szCs w:val="32"/>
+        </w:rPr>
+        <w:t xml:space="preserve">Scenario 1: </w:t>
+      </w:r>
+      <w:r>
+        <w:rPr>
+          <w:i/>
+          <w:iCs/>
+          <w:color w:val="0F4761" w:themeColor="accent1" w:themeShade="BF"/>
+          <w:sz w:val="32"/>
+          <w:szCs w:val="32"/>
+        </w:rPr>
+        <w:t>Automating Manual Review of Payment Related Tasks</w:t>
+      </w:r>
+      <w:r>
+        <w:rPr>
+          <w:i/>
+          <w:iCs/>
+          <w:color w:val="0F4761" w:themeColor="accent1" w:themeShade="BF"/>
+          <w:sz w:val="32"/>
+          <w:szCs w:val="32"/>
+        </w:rPr>
+        <w:t>)</w:t>
       </w:r>
     </w:p>
     <w:p>
@@ -141,25 +183,39 @@
         <w:rPr>
           <w:highlight w:val="yellow"/>
         </w:rPr>
-        <w:t>for coding scenario</w:t>
+        <w:t xml:space="preserve">for coding scenario </w:t>
       </w:r>
       <w:r>
         <w:rPr>
           <w:highlight w:val="yellow"/>
         </w:rPr>
-        <w:t>,</w:t>
-      </w:r>
+        <w:t xml:space="preserve">since I already had the subscription </w:t>
+      </w:r>
+      <w:proofErr w:type="gramStart"/>
       <w:r>
         <w:rPr>
           <w:highlight w:val="yellow"/>
         </w:rPr>
+        <w:t xml:space="preserve">to </w:t>
+      </w:r>
+      <w:r>
+        <w:rPr>
+          <w:highlight w:val="yellow"/>
+        </w:rPr>
         <w:t xml:space="preserve"> </w:t>
       </w:r>
       <w:r>
         <w:rPr>
           <w:highlight w:val="yellow"/>
         </w:rPr>
-        <w:t>since I already had the API subscription for it</w:t>
+        <w:t>OpenAI</w:t>
+      </w:r>
+      <w:proofErr w:type="gramEnd"/>
+      <w:r>
+        <w:rPr>
+          <w:highlight w:val="yellow"/>
+        </w:rPr>
+        <w:t xml:space="preserve"> API</w:t>
       </w:r>
       <w:r>
         <w:rPr>
@@ -545,6 +601,7 @@
       <w:r>
         <w:t xml:space="preserve"> I am selecting </w:t>
       </w:r>
+      <w:proofErr w:type="spellStart"/>
       <w:r>
         <w:rPr>
           <w:b/>
@@ -552,6 +609,7 @@
         </w:rPr>
         <w:t>CrewAI</w:t>
       </w:r>
+      <w:proofErr w:type="spellEnd"/>
       <w:r>
         <w:t xml:space="preserve"> framework</w:t>
       </w:r>
@@ -568,10 +626,26 @@
         <w:t>could’ve chosen some other framework</w:t>
       </w:r>
       <w:r>
-        <w:t xml:space="preserve"> (…like AutoGen)</w:t>
-      </w:r>
-      <w:r>
-        <w:t xml:space="preserve"> but due to time constraints going with CrewAI for now)</w:t>
+        <w:t xml:space="preserve"> (…like </w:t>
+      </w:r>
+      <w:proofErr w:type="spellStart"/>
+      <w:r>
+        <w:t>AutoGen</w:t>
+      </w:r>
+      <w:proofErr w:type="spellEnd"/>
+      <w:r>
+        <w:t>)</w:t>
+      </w:r>
+      <w:r>
+        <w:t xml:space="preserve"> but due to time constraints going with </w:t>
+      </w:r>
+      <w:proofErr w:type="spellStart"/>
+      <w:r>
+        <w:t>CrewAI</w:t>
+      </w:r>
+      <w:proofErr w:type="spellEnd"/>
+      <w:r>
+        <w:t xml:space="preserve"> for now)</w:t>
       </w:r>
     </w:p>
     <w:p>
@@ -616,9 +690,13 @@
       <w:r>
         <w:t xml:space="preserve">i.e. </w:t>
       </w:r>
+      <w:proofErr w:type="spellStart"/>
+      <w:proofErr w:type="gramStart"/>
       <w:r>
         <w:t>crew.kickoff</w:t>
       </w:r>
+      <w:proofErr w:type="spellEnd"/>
+      <w:proofErr w:type="gramEnd"/>
       <w:r>
         <w:t>()</w:t>
       </w:r>
@@ -741,7 +819,6 @@
         </w:numPr>
       </w:pPr>
       <w:r>
-        <w:lastRenderedPageBreak/>
         <w:t>Internal delegation possible</w:t>
       </w:r>
       <w:r>
@@ -772,7 +849,15 @@
         </w:numPr>
       </w:pPr>
       <w:r>
-        <w:t>Code might get complicated and hard to understand as CrewAI relies upon different agents and those agents have different backstories, tasks,</w:t>
+        <w:t xml:space="preserve">Code might get complicated and hard to understand as </w:t>
+      </w:r>
+      <w:proofErr w:type="spellStart"/>
+      <w:r>
+        <w:t>CrewAI</w:t>
+      </w:r>
+      <w:proofErr w:type="spellEnd"/>
+      <w:r>
+        <w:t xml:space="preserve"> relies upon different agents and those agents have different backstories, tasks,</w:t>
       </w:r>
       <w:r>
         <w:t xml:space="preserve"> roles, etc.</w:t>
@@ -799,7 +884,28 @@
         <w:t xml:space="preserve"> harder later</w:t>
       </w:r>
       <w:r>
-        <w:t xml:space="preserve"> as CrewAI uses it’s own internal tools</w:t>
+        <w:t xml:space="preserve"> as </w:t>
+      </w:r>
+      <w:proofErr w:type="spellStart"/>
+      <w:r>
+        <w:t>CrewAI</w:t>
+      </w:r>
+      <w:proofErr w:type="spellEnd"/>
+      <w:r>
+        <w:t xml:space="preserve"> uses </w:t>
+      </w:r>
+      <w:proofErr w:type="spellStart"/>
+      <w:proofErr w:type="gramStart"/>
+      <w:r>
+        <w:t>it’s</w:t>
+      </w:r>
+      <w:proofErr w:type="spellEnd"/>
+      <w:proofErr w:type="gramEnd"/>
+      <w:r>
+        <w:t xml:space="preserve"> own internal tools</w:t>
+      </w:r>
+      <w:r>
+        <w:t xml:space="preserve"> too</w:t>
       </w:r>
       <w:r>
         <w:t xml:space="preserve"> (</w:t>
@@ -807,9 +913,11 @@
       <w:r>
         <w:t xml:space="preserve">like </w:t>
       </w:r>
+      <w:proofErr w:type="spellStart"/>
       <w:r>
         <w:t>vision_tool</w:t>
       </w:r>
+      <w:proofErr w:type="spellEnd"/>
       <w:r>
         <w:t>)</w:t>
       </w:r>
@@ -904,6 +1012,9 @@
         </w:numPr>
       </w:pPr>
       <w:r>
+        <w:rPr>
+          <w:noProof/>
+        </w:rPr>
         <w:drawing>
           <wp:anchor distT="0" distB="0" distL="114300" distR="114300" simplePos="0" relativeHeight="251659264" behindDoc="0" locked="0" layoutInCell="1" allowOverlap="1" wp14:anchorId="40A3C9D8" wp14:editId="15C6888B">
             <wp:simplePos x="0" y="0"/>
@@ -1015,6 +1126,9 @@
         </w:numPr>
       </w:pPr>
       <w:r>
+        <w:rPr>
+          <w:noProof/>
+        </w:rPr>
         <w:drawing>
           <wp:anchor distT="0" distB="0" distL="114300" distR="114300" simplePos="0" relativeHeight="251662336" behindDoc="0" locked="0" layoutInCell="1" allowOverlap="1" wp14:anchorId="22057FBA" wp14:editId="04378F05">
             <wp:simplePos x="0" y="0"/>
@@ -1089,6 +1203,9 @@
         </w:drawing>
       </w:r>
       <w:r>
+        <w:rPr>
+          <w:noProof/>
+        </w:rPr>
         <w:drawing>
           <wp:anchor distT="0" distB="0" distL="114300" distR="114300" simplePos="0" relativeHeight="251661312" behindDoc="0" locked="0" layoutInCell="1" allowOverlap="1" wp14:anchorId="335E932C" wp14:editId="62766970">
             <wp:simplePos x="0" y="0"/>
@@ -1216,6 +1333,7 @@
       <w:r>
         <w:t xml:space="preserve"> using </w:t>
       </w:r>
+      <w:proofErr w:type="spellStart"/>
       <w:r>
         <w:rPr>
           <w:i/>
@@ -1223,6 +1341,7 @@
         </w:rPr>
         <w:t>asyncio</w:t>
       </w:r>
+      <w:proofErr w:type="spellEnd"/>
       <w:r>
         <w:t>,</w:t>
       </w:r>
@@ -1235,6 +1354,691 @@
       <w:r>
         <w:t>)</w:t>
       </w:r>
+    </w:p>
+    <w:p>
+      <w:pPr>
+        <w:pStyle w:val="Heading1"/>
+        <w:rPr>
+          <w:sz w:val="28"/>
+          <w:szCs w:val="28"/>
+        </w:rPr>
+      </w:pPr>
+      <w:r>
+        <w:rPr>
+          <w:sz w:val="28"/>
+          <w:szCs w:val="28"/>
+        </w:rPr>
+        <w:t xml:space="preserve">Production-ready </w:t>
+      </w:r>
+      <w:r>
+        <w:rPr>
+          <w:sz w:val="28"/>
+          <w:szCs w:val="28"/>
+        </w:rPr>
+        <w:t>build</w:t>
+      </w:r>
+    </w:p>
+    <w:p>
+      <w:r>
+        <w:t>Th</w:t>
+      </w:r>
+      <w:r>
+        <w:t>is</w:t>
+      </w:r>
+      <w:r>
+        <w:t xml:space="preserve"> solution builds upon a functional proof-of-concept</w:t>
+      </w:r>
+      <w:r>
+        <w:t xml:space="preserve"> using </w:t>
+      </w:r>
+      <w:r>
+        <w:t xml:space="preserve">multi-agent AI system powered by </w:t>
+      </w:r>
+      <w:proofErr w:type="spellStart"/>
+      <w:r>
+        <w:t>CrewAI</w:t>
+      </w:r>
+      <w:proofErr w:type="spellEnd"/>
+      <w:r>
+        <w:t xml:space="preserve"> and Azure cloud services</w:t>
+      </w:r>
+      <w:r>
+        <w:t>.</w:t>
+      </w:r>
+    </w:p>
+    <w:p>
+      <w:pPr>
+        <w:pStyle w:val="ListParagraph"/>
+        <w:numPr>
+          <w:ilvl w:val="0"/>
+          <w:numId w:val="7"/>
+        </w:numPr>
+      </w:pPr>
+      <w:r>
+        <w:t>Core Agents</w:t>
+      </w:r>
+      <w:r>
+        <w:t>:</w:t>
+      </w:r>
+    </w:p>
+    <w:p>
+      <w:pPr>
+        <w:pStyle w:val="ListParagraph"/>
+        <w:numPr>
+          <w:ilvl w:val="1"/>
+          <w:numId w:val="7"/>
+        </w:numPr>
+      </w:pPr>
+      <w:r>
+        <w:rPr>
+          <w:i/>
+          <w:iCs/>
+        </w:rPr>
+        <w:t>Policy Compliance Specialist</w:t>
+      </w:r>
+      <w:r>
+        <w:t>:</w:t>
+      </w:r>
+    </w:p>
+    <w:p>
+      <w:pPr>
+        <w:pStyle w:val="ListParagraph"/>
+        <w:ind w:left="1440"/>
+      </w:pPr>
+      <w:r>
+        <w:t xml:space="preserve">This agent will be responsible for </w:t>
+      </w:r>
+      <w:r>
+        <w:t>interpreting complex policy documents</w:t>
+      </w:r>
+      <w:r>
+        <w:t xml:space="preserve"> using </w:t>
+      </w:r>
+      <w:proofErr w:type="spellStart"/>
+      <w:r>
+        <w:rPr>
+          <w:b/>
+          <w:bCs/>
+        </w:rPr>
+        <w:t>ChromaDB</w:t>
+      </w:r>
+      <w:proofErr w:type="spellEnd"/>
+      <w:r>
+        <w:rPr>
+          <w:b/>
+          <w:bCs/>
+        </w:rPr>
+        <w:t xml:space="preserve"> vector store</w:t>
+      </w:r>
+      <w:r>
+        <w:t>, using tools parameter</w:t>
+      </w:r>
+      <w:r>
+        <w:t xml:space="preserve"> </w:t>
+      </w:r>
+      <w:r>
+        <w:t>(</w:t>
+      </w:r>
+      <w:r>
+        <w:t>…</w:t>
+      </w:r>
+      <w:r>
+        <w:t>Azure AI Search</w:t>
+      </w:r>
+      <w:r>
+        <w:t xml:space="preserve"> can be used but would be </w:t>
+      </w:r>
+      <w:r>
+        <w:t xml:space="preserve">another </w:t>
+      </w:r>
+      <w:r>
+        <w:t>overkill as the scenario describes around</w:t>
+      </w:r>
+      <w:r>
+        <w:t xml:space="preserve"> 25000+ tasks</w:t>
+      </w:r>
+      <w:r>
+        <w:t>)</w:t>
+      </w:r>
+    </w:p>
+    <w:p>
+      <w:pPr>
+        <w:pStyle w:val="ListParagraph"/>
+        <w:numPr>
+          <w:ilvl w:val="1"/>
+          <w:numId w:val="7"/>
+        </w:numPr>
+      </w:pPr>
+      <w:r>
+        <w:rPr>
+          <w:i/>
+          <w:iCs/>
+        </w:rPr>
+        <w:t>Case Documentation Specialist</w:t>
+      </w:r>
+      <w:r>
+        <w:t xml:space="preserve">: </w:t>
+      </w:r>
+    </w:p>
+    <w:p>
+      <w:pPr>
+        <w:pStyle w:val="ListParagraph"/>
+        <w:ind w:left="1440"/>
+      </w:pPr>
+      <w:r>
+        <w:t>S</w:t>
+      </w:r>
+      <w:r>
+        <w:t>ummari</w:t>
+      </w:r>
+      <w:r>
+        <w:t>zes medical and claim history</w:t>
+      </w:r>
+    </w:p>
+    <w:p>
+      <w:pPr>
+        <w:pStyle w:val="ListParagraph"/>
+        <w:numPr>
+          <w:ilvl w:val="1"/>
+          <w:numId w:val="7"/>
+        </w:numPr>
+      </w:pPr>
+      <w:r>
+        <w:rPr>
+          <w:i/>
+          <w:iCs/>
+        </w:rPr>
+        <w:t>Payment Authorization Officer</w:t>
+      </w:r>
+      <w:r>
+        <w:t>:</w:t>
+      </w:r>
+    </w:p>
+    <w:p>
+      <w:pPr>
+        <w:pStyle w:val="ListParagraph"/>
+        <w:ind w:left="1440"/>
+      </w:pPr>
+      <w:r>
+        <w:t>E</w:t>
+      </w:r>
+      <w:r>
+        <w:t>valuates medical invoices</w:t>
+      </w:r>
+      <w:r>
+        <w:t xml:space="preserve"> of injured workers</w:t>
+      </w:r>
+      <w:r>
+        <w:t>, ensuring payments comply with policies while balancing fiscal responsibility and quality care.</w:t>
+      </w:r>
+    </w:p>
+    <w:p>
+      <w:pPr>
+        <w:pStyle w:val="ListParagraph"/>
+        <w:numPr>
+          <w:ilvl w:val="1"/>
+          <w:numId w:val="7"/>
+        </w:numPr>
+        <w:rPr>
+          <w:i/>
+          <w:iCs/>
+        </w:rPr>
+      </w:pPr>
+      <w:r>
+        <w:rPr>
+          <w:i/>
+          <w:iCs/>
+        </w:rPr>
+        <w:t>Claims Escalation Coordinator</w:t>
+      </w:r>
+      <w:r>
+        <w:rPr>
+          <w:i/>
+          <w:iCs/>
+        </w:rPr>
+        <w:t>:</w:t>
+      </w:r>
+    </w:p>
+    <w:p>
+      <w:pPr>
+        <w:pStyle w:val="ListParagraph"/>
+        <w:ind w:left="1440"/>
+      </w:pPr>
+      <w:r>
+        <w:rPr>
+          <w:i/>
+          <w:iCs/>
+        </w:rPr>
+        <w:drawing>
+          <wp:anchor distT="0" distB="0" distL="114300" distR="114300" simplePos="0" relativeHeight="251663360" behindDoc="0" locked="0" layoutInCell="1" allowOverlap="1" wp14:anchorId="68963C77" wp14:editId="21DC0655">
+            <wp:simplePos x="0" y="0"/>
+            <wp:positionH relativeFrom="margin">
+              <wp:align>center</wp:align>
+            </wp:positionH>
+            <wp:positionV relativeFrom="paragraph">
+              <wp:posOffset>481330</wp:posOffset>
+            </wp:positionV>
+            <wp:extent cx="5093335" cy="2176780"/>
+            <wp:effectExtent l="0" t="0" r="0" b="0"/>
+            <wp:wrapThrough wrapText="bothSides">
+              <wp:wrapPolygon edited="0">
+                <wp:start x="0" y="0"/>
+                <wp:lineTo x="0" y="21361"/>
+                <wp:lineTo x="21490" y="21361"/>
+                <wp:lineTo x="21490" y="0"/>
+                <wp:lineTo x="0" y="0"/>
+              </wp:wrapPolygon>
+            </wp:wrapThrough>
+            <wp:docPr id="1886755418" name="Picture 1" descr="A screenshot of a computer screen&#10;&#10;AI-generated content may be incorrect."/>
+            <wp:cNvGraphicFramePr>
+              <a:graphicFrameLocks xmlns:a="http://schemas.openxmlformats.org/drawingml/2006/main" noChangeAspect="1"/>
+            </wp:cNvGraphicFramePr>
+            <a:graphic xmlns:a="http://schemas.openxmlformats.org/drawingml/2006/main">
+              <a:graphicData uri="http://schemas.openxmlformats.org/drawingml/2006/picture">
+                <pic:pic xmlns:pic="http://schemas.openxmlformats.org/drawingml/2006/picture">
+                  <pic:nvPicPr>
+                    <pic:cNvPr id="1886755418" name="Picture 1" descr="A screenshot of a computer screen&#10;&#10;AI-generated content may be incorrect."/>
+                    <pic:cNvPicPr/>
+                  </pic:nvPicPr>
+                  <pic:blipFill>
+                    <a:blip r:embed="rId9" cstate="print">
+                      <a:extLst>
+                        <a:ext uri="{28A0092B-C50C-407E-A947-70E740481C1C}">
+                          <a14:useLocalDpi xmlns:a14="http://schemas.microsoft.com/office/drawing/2010/main" val="0"/>
+                        </a:ext>
+                      </a:extLst>
+                    </a:blip>
+                    <a:stretch>
+                      <a:fillRect/>
+                    </a:stretch>
+                  </pic:blipFill>
+                  <pic:spPr>
+                    <a:xfrm>
+                      <a:off x="0" y="0"/>
+                      <a:ext cx="5093335" cy="2176780"/>
+                    </a:xfrm>
+                    <a:prstGeom prst="rect">
+                      <a:avLst/>
+                    </a:prstGeom>
+                  </pic:spPr>
+                </pic:pic>
+              </a:graphicData>
+            </a:graphic>
+            <wp14:sizeRelH relativeFrom="margin">
+              <wp14:pctWidth>0</wp14:pctWidth>
+            </wp14:sizeRelH>
+            <wp14:sizeRelV relativeFrom="margin">
+              <wp14:pctHeight>0</wp14:pctHeight>
+            </wp14:sizeRelV>
+          </wp:anchor>
+        </w:drawing>
+      </w:r>
+      <w:r>
+        <w:t>Escalates the invoice</w:t>
+      </w:r>
+      <w:r>
+        <w:t xml:space="preserve"> </w:t>
+      </w:r>
+      <w:r>
+        <w:t>to human reviewers</w:t>
+      </w:r>
+      <w:r>
+        <w:t xml:space="preserve"> </w:t>
+      </w:r>
+      <w:r>
+        <w:t xml:space="preserve">either by </w:t>
+      </w:r>
+      <w:proofErr w:type="gramStart"/>
+      <w:r>
+        <w:t>email notification</w:t>
+      </w:r>
+      <w:proofErr w:type="gramEnd"/>
+      <w:r>
+        <w:t xml:space="preserve"> or task management system like JIRA.</w:t>
+      </w:r>
+      <w:r>
+        <w:rPr>
+          <w:i/>
+          <w:iCs/>
+        </w:rPr>
+        <w:br/>
+      </w:r>
+      <w:r>
+        <w:rPr>
+          <w:i/>
+          <w:iCs/>
+        </w:rPr>
+        <w:br/>
+      </w:r>
+      <w:r>
+        <w:rPr>
+          <w:i/>
+          <w:iCs/>
+        </w:rPr>
+        <w:br/>
+      </w:r>
+      <w:r>
+        <w:rPr>
+          <w:i/>
+          <w:iCs/>
+        </w:rPr>
+        <w:br/>
+      </w:r>
+      <w:r>
+        <w:rPr>
+          <w:i/>
+          <w:iCs/>
+        </w:rPr>
+        <w:br/>
+      </w:r>
+      <w:r>
+        <w:rPr>
+          <w:i/>
+          <w:iCs/>
+        </w:rPr>
+        <w:br/>
+      </w:r>
+      <w:r>
+        <w:rPr>
+          <w:i/>
+          <w:iCs/>
+        </w:rPr>
+        <w:br/>
+      </w:r>
+      <w:r>
+        <w:rPr>
+          <w:i/>
+          <w:iCs/>
+        </w:rPr>
+        <w:br/>
+      </w:r>
+      <w:r>
+        <w:rPr>
+          <w:i/>
+          <w:iCs/>
+        </w:rPr>
+        <w:br/>
+      </w:r>
+    </w:p>
+    <w:p/>
+    <w:p>
+      <w:pPr>
+        <w:pStyle w:val="ListParagraph"/>
+        <w:numPr>
+          <w:ilvl w:val="0"/>
+          <w:numId w:val="7"/>
+        </w:numPr>
+      </w:pPr>
+      <w:r>
+        <w:t>Task</w:t>
+      </w:r>
+      <w:r>
+        <w:t>s</w:t>
+      </w:r>
+      <w:r>
+        <w:t xml:space="preserve">: </w:t>
+      </w:r>
+    </w:p>
+    <w:p>
+      <w:pPr>
+        <w:pStyle w:val="ListParagraph"/>
+        <w:numPr>
+          <w:ilvl w:val="1"/>
+          <w:numId w:val="7"/>
+        </w:numPr>
+      </w:pPr>
+      <w:r>
+        <w:rPr>
+          <w:i/>
+          <w:iCs/>
+        </w:rPr>
+        <w:t>R</w:t>
+      </w:r>
+      <w:r>
+        <w:rPr>
+          <w:i/>
+          <w:iCs/>
+        </w:rPr>
+        <w:t>etrieve</w:t>
+      </w:r>
+      <w:r>
+        <w:rPr>
+          <w:i/>
+          <w:iCs/>
+        </w:rPr>
+        <w:t xml:space="preserve"> A</w:t>
+      </w:r>
+      <w:r>
+        <w:rPr>
+          <w:i/>
+          <w:iCs/>
+        </w:rPr>
+        <w:t>pplicable</w:t>
+      </w:r>
+      <w:r>
+        <w:rPr>
+          <w:i/>
+          <w:iCs/>
+        </w:rPr>
+        <w:t xml:space="preserve"> P</w:t>
+      </w:r>
+      <w:r>
+        <w:rPr>
+          <w:i/>
+          <w:iCs/>
+        </w:rPr>
+        <w:t>olicies</w:t>
+      </w:r>
+      <w:r>
+        <w:t>:</w:t>
+      </w:r>
+    </w:p>
+    <w:p>
+      <w:pPr>
+        <w:pStyle w:val="ListParagraph"/>
+        <w:ind w:left="1440"/>
+      </w:pPr>
+      <w:r>
+        <w:t xml:space="preserve">Analyze the invoice details and retrieve all applicable </w:t>
+      </w:r>
+      <w:proofErr w:type="spellStart"/>
+      <w:r>
+        <w:t>WorkSafeBC</w:t>
+      </w:r>
+      <w:proofErr w:type="spellEnd"/>
+      <w:r>
+        <w:t xml:space="preserve"> policies</w:t>
+      </w:r>
+    </w:p>
+    <w:p>
+      <w:pPr>
+        <w:pStyle w:val="ListParagraph"/>
+        <w:numPr>
+          <w:ilvl w:val="1"/>
+          <w:numId w:val="7"/>
+        </w:numPr>
+      </w:pPr>
+      <w:r>
+        <w:t>S</w:t>
+      </w:r>
+      <w:r>
+        <w:t>ummarize</w:t>
+      </w:r>
+      <w:r>
+        <w:t xml:space="preserve"> C</w:t>
+      </w:r>
+      <w:r>
+        <w:t>ase</w:t>
+      </w:r>
+      <w:r>
+        <w:t>:</w:t>
+      </w:r>
+    </w:p>
+    <w:p>
+      <w:pPr>
+        <w:pStyle w:val="ListParagraph"/>
+        <w:ind w:left="1440"/>
+      </w:pPr>
+      <w:r>
+        <w:t>Create a comprehensive case summary for payment review</w:t>
+      </w:r>
+    </w:p>
+    <w:p>
+      <w:pPr>
+        <w:pStyle w:val="ListParagraph"/>
+        <w:ind w:left="1440"/>
+      </w:pPr>
+    </w:p>
+    <w:p>
+      <w:pPr>
+        <w:pStyle w:val="ListParagraph"/>
+        <w:numPr>
+          <w:ilvl w:val="1"/>
+          <w:numId w:val="7"/>
+        </w:numPr>
+      </w:pPr>
+      <w:r>
+        <w:lastRenderedPageBreak/>
+        <w:t>R</w:t>
+      </w:r>
+      <w:r>
+        <w:t>eview</w:t>
+      </w:r>
+      <w:r>
+        <w:t xml:space="preserve"> P</w:t>
+      </w:r>
+      <w:r>
+        <w:t>ayment</w:t>
+      </w:r>
+      <w:r>
+        <w:t>:</w:t>
+      </w:r>
+    </w:p>
+    <w:p>
+      <w:pPr>
+        <w:pStyle w:val="ListParagraph"/>
+        <w:ind w:left="1440"/>
+      </w:pPr>
+      <w:r>
+        <w:t>Review the invoice and make a payment decision</w:t>
+      </w:r>
+    </w:p>
+    <w:p>
+      <w:pPr>
+        <w:pStyle w:val="ListParagraph"/>
+        <w:numPr>
+          <w:ilvl w:val="1"/>
+          <w:numId w:val="7"/>
+        </w:numPr>
+      </w:pPr>
+      <w:r>
+        <w:rPr>
+          <w:i/>
+          <w:iCs/>
+        </w:rPr>
+        <w:t>Escalation R</w:t>
+      </w:r>
+      <w:r>
+        <w:rPr>
+          <w:i/>
+          <w:iCs/>
+        </w:rPr>
+        <w:t>outing</w:t>
+      </w:r>
+      <w:r>
+        <w:t>:</w:t>
+      </w:r>
+    </w:p>
+    <w:p>
+      <w:pPr>
+        <w:pStyle w:val="ListParagraph"/>
+        <w:ind w:left="1440"/>
+      </w:pPr>
+      <w:r>
+        <w:t>Review the payment decision and determine if escalation is needed</w:t>
+      </w:r>
+    </w:p>
+    <w:p>
+      <w:pPr>
+        <w:pStyle w:val="ListParagraph"/>
+        <w:ind w:left="1440"/>
+      </w:pPr>
+      <w:r>
+        <w:drawing>
+          <wp:anchor distT="0" distB="0" distL="114300" distR="114300" simplePos="0" relativeHeight="251665408" behindDoc="0" locked="0" layoutInCell="1" allowOverlap="1" wp14:anchorId="05E0F8B4" wp14:editId="58AD5835">
+            <wp:simplePos x="0" y="0"/>
+            <wp:positionH relativeFrom="margin">
+              <wp:posOffset>1571837</wp:posOffset>
+            </wp:positionH>
+            <wp:positionV relativeFrom="paragraph">
+              <wp:posOffset>181398</wp:posOffset>
+            </wp:positionV>
+            <wp:extent cx="3531235" cy="1699895"/>
+            <wp:effectExtent l="0" t="0" r="0" b="0"/>
+            <wp:wrapThrough wrapText="bothSides">
+              <wp:wrapPolygon edited="0">
+                <wp:start x="0" y="0"/>
+                <wp:lineTo x="0" y="21301"/>
+                <wp:lineTo x="21441" y="21301"/>
+                <wp:lineTo x="21441" y="0"/>
+                <wp:lineTo x="0" y="0"/>
+              </wp:wrapPolygon>
+            </wp:wrapThrough>
+            <wp:docPr id="813146633" name="Picture 1" descr="A screenshot of a computer program&#10;&#10;AI-generated content may be incorrect."/>
+            <wp:cNvGraphicFramePr>
+              <a:graphicFrameLocks xmlns:a="http://schemas.openxmlformats.org/drawingml/2006/main" noChangeAspect="1"/>
+            </wp:cNvGraphicFramePr>
+            <a:graphic xmlns:a="http://schemas.openxmlformats.org/drawingml/2006/main">
+              <a:graphicData uri="http://schemas.openxmlformats.org/drawingml/2006/picture">
+                <pic:pic xmlns:pic="http://schemas.openxmlformats.org/drawingml/2006/picture">
+                  <pic:nvPicPr>
+                    <pic:cNvPr id="813146633" name="Picture 1" descr="A screenshot of a computer program&#10;&#10;AI-generated content may be incorrect."/>
+                    <pic:cNvPicPr/>
+                  </pic:nvPicPr>
+                  <pic:blipFill>
+                    <a:blip r:embed="rId10" cstate="print">
+                      <a:extLst>
+                        <a:ext uri="{28A0092B-C50C-407E-A947-70E740481C1C}">
+                          <a14:useLocalDpi xmlns:a14="http://schemas.microsoft.com/office/drawing/2010/main" val="0"/>
+                        </a:ext>
+                      </a:extLst>
+                    </a:blip>
+                    <a:stretch>
+                      <a:fillRect/>
+                    </a:stretch>
+                  </pic:blipFill>
+                  <pic:spPr>
+                    <a:xfrm>
+                      <a:off x="0" y="0"/>
+                      <a:ext cx="3531235" cy="1699895"/>
+                    </a:xfrm>
+                    <a:prstGeom prst="rect">
+                      <a:avLst/>
+                    </a:prstGeom>
+                  </pic:spPr>
+                </pic:pic>
+              </a:graphicData>
+            </a:graphic>
+            <wp14:sizeRelH relativeFrom="margin">
+              <wp14:pctWidth>0</wp14:pctWidth>
+            </wp14:sizeRelH>
+            <wp14:sizeRelV relativeFrom="margin">
+              <wp14:pctHeight>0</wp14:pctHeight>
+            </wp14:sizeRelV>
+          </wp:anchor>
+        </w:drawing>
+      </w:r>
+    </w:p>
+    <w:p/>
+    <w:p/>
+    <w:p/>
+    <w:p/>
+    <w:p/>
+    <w:p/>
+    <w:p>
+      <w:pPr>
+        <w:ind w:firstLine="720"/>
+      </w:pPr>
     </w:p>
     <w:sectPr>
       <w:pgSz w:w="12240" w:h="15840"/>
@@ -1540,6 +2344,211 @@
     </w:lvl>
   </w:abstractNum>
   <w:abstractNum w:abstractNumId="3" w15:restartNumberingAfterBreak="0">
+    <w:nsid w:val="4A2E0848"/>
+    <w:multiLevelType w:val="hybridMultilevel"/>
+    <w:tmpl w:val="E6F26ED6"/>
+    <w:lvl w:ilvl="0" w:tplc="0409000F">
+      <w:start w:val="1"/>
+      <w:numFmt w:val="decimal"/>
+      <w:lvlText w:val="%1."/>
+      <w:lvlJc w:val="left"/>
+      <w:pPr>
+        <w:ind w:left="720" w:hanging="360"/>
+      </w:pPr>
+      <w:rPr>
+        <w:rFonts w:hint="default"/>
+      </w:rPr>
+    </w:lvl>
+    <w:lvl w:ilvl="1" w:tplc="04090001">
+      <w:start w:val="1"/>
+      <w:numFmt w:val="bullet"/>
+      <w:lvlText w:val=""/>
+      <w:lvlJc w:val="left"/>
+      <w:pPr>
+        <w:ind w:left="1440" w:hanging="360"/>
+      </w:pPr>
+      <w:rPr>
+        <w:rFonts w:ascii="Symbol" w:hAnsi="Symbol" w:hint="default"/>
+      </w:rPr>
+    </w:lvl>
+    <w:lvl w:ilvl="2" w:tplc="0409001B" w:tentative="1">
+      <w:start w:val="1"/>
+      <w:numFmt w:val="lowerRoman"/>
+      <w:lvlText w:val="%3."/>
+      <w:lvlJc w:val="right"/>
+      <w:pPr>
+        <w:ind w:left="2160" w:hanging="180"/>
+      </w:pPr>
+    </w:lvl>
+    <w:lvl w:ilvl="3" w:tplc="0409000F" w:tentative="1">
+      <w:start w:val="1"/>
+      <w:numFmt w:val="decimal"/>
+      <w:lvlText w:val="%4."/>
+      <w:lvlJc w:val="left"/>
+      <w:pPr>
+        <w:ind w:left="2880" w:hanging="360"/>
+      </w:pPr>
+    </w:lvl>
+    <w:lvl w:ilvl="4" w:tplc="04090019" w:tentative="1">
+      <w:start w:val="1"/>
+      <w:numFmt w:val="lowerLetter"/>
+      <w:lvlText w:val="%5."/>
+      <w:lvlJc w:val="left"/>
+      <w:pPr>
+        <w:ind w:left="3600" w:hanging="360"/>
+      </w:pPr>
+    </w:lvl>
+    <w:lvl w:ilvl="5" w:tplc="0409001B" w:tentative="1">
+      <w:start w:val="1"/>
+      <w:numFmt w:val="lowerRoman"/>
+      <w:lvlText w:val="%6."/>
+      <w:lvlJc w:val="right"/>
+      <w:pPr>
+        <w:ind w:left="4320" w:hanging="180"/>
+      </w:pPr>
+    </w:lvl>
+    <w:lvl w:ilvl="6" w:tplc="0409000F" w:tentative="1">
+      <w:start w:val="1"/>
+      <w:numFmt w:val="decimal"/>
+      <w:lvlText w:val="%7."/>
+      <w:lvlJc w:val="left"/>
+      <w:pPr>
+        <w:ind w:left="5040" w:hanging="360"/>
+      </w:pPr>
+    </w:lvl>
+    <w:lvl w:ilvl="7" w:tplc="04090019" w:tentative="1">
+      <w:start w:val="1"/>
+      <w:numFmt w:val="lowerLetter"/>
+      <w:lvlText w:val="%8."/>
+      <w:lvlJc w:val="left"/>
+      <w:pPr>
+        <w:ind w:left="5760" w:hanging="360"/>
+      </w:pPr>
+    </w:lvl>
+    <w:lvl w:ilvl="8" w:tplc="0409001B" w:tentative="1">
+      <w:start w:val="1"/>
+      <w:numFmt w:val="lowerRoman"/>
+      <w:lvlText w:val="%9."/>
+      <w:lvlJc w:val="right"/>
+      <w:pPr>
+        <w:ind w:left="6480" w:hanging="180"/>
+      </w:pPr>
+    </w:lvl>
+  </w:abstractNum>
+  <w:abstractNum w:abstractNumId="4" w15:restartNumberingAfterBreak="0">
+    <w:nsid w:val="5A3437EB"/>
+    <w:multiLevelType w:val="multilevel"/>
+    <w:tmpl w:val="E1A61840"/>
+    <w:lvl w:ilvl="0">
+      <w:start w:val="1"/>
+      <w:numFmt w:val="decimal"/>
+      <w:lvlText w:val="%1."/>
+      <w:lvlJc w:val="left"/>
+      <w:pPr>
+        <w:ind w:left="400" w:hanging="400"/>
+      </w:pPr>
+      <w:rPr>
+        <w:rFonts w:hint="default"/>
+      </w:rPr>
+    </w:lvl>
+    <w:lvl w:ilvl="1">
+      <w:start w:val="1"/>
+      <w:numFmt w:val="decimal"/>
+      <w:lvlText w:val="%1.%2."/>
+      <w:lvlJc w:val="left"/>
+      <w:pPr>
+        <w:ind w:left="720" w:hanging="720"/>
+      </w:pPr>
+      <w:rPr>
+        <w:rFonts w:hint="default"/>
+      </w:rPr>
+    </w:lvl>
+    <w:lvl w:ilvl="2">
+      <w:start w:val="1"/>
+      <w:numFmt w:val="decimal"/>
+      <w:lvlText w:val="%1.%2.%3."/>
+      <w:lvlJc w:val="left"/>
+      <w:pPr>
+        <w:ind w:left="720" w:hanging="720"/>
+      </w:pPr>
+      <w:rPr>
+        <w:rFonts w:hint="default"/>
+      </w:rPr>
+    </w:lvl>
+    <w:lvl w:ilvl="3">
+      <w:start w:val="1"/>
+      <w:numFmt w:val="decimal"/>
+      <w:lvlText w:val="%1.%2.%3.%4."/>
+      <w:lvlJc w:val="left"/>
+      <w:pPr>
+        <w:ind w:left="1080" w:hanging="1080"/>
+      </w:pPr>
+      <w:rPr>
+        <w:rFonts w:hint="default"/>
+      </w:rPr>
+    </w:lvl>
+    <w:lvl w:ilvl="4">
+      <w:start w:val="1"/>
+      <w:numFmt w:val="decimal"/>
+      <w:lvlText w:val="%1.%2.%3.%4.%5."/>
+      <w:lvlJc w:val="left"/>
+      <w:pPr>
+        <w:ind w:left="1080" w:hanging="1080"/>
+      </w:pPr>
+      <w:rPr>
+        <w:rFonts w:hint="default"/>
+      </w:rPr>
+    </w:lvl>
+    <w:lvl w:ilvl="5">
+      <w:start w:val="1"/>
+      <w:numFmt w:val="decimal"/>
+      <w:lvlText w:val="%1.%2.%3.%4.%5.%6."/>
+      <w:lvlJc w:val="left"/>
+      <w:pPr>
+        <w:ind w:left="1440" w:hanging="1440"/>
+      </w:pPr>
+      <w:rPr>
+        <w:rFonts w:hint="default"/>
+      </w:rPr>
+    </w:lvl>
+    <w:lvl w:ilvl="6">
+      <w:start w:val="1"/>
+      <w:numFmt w:val="decimal"/>
+      <w:lvlText w:val="%1.%2.%3.%4.%5.%6.%7."/>
+      <w:lvlJc w:val="left"/>
+      <w:pPr>
+        <w:ind w:left="1440" w:hanging="1440"/>
+      </w:pPr>
+      <w:rPr>
+        <w:rFonts w:hint="default"/>
+      </w:rPr>
+    </w:lvl>
+    <w:lvl w:ilvl="7">
+      <w:start w:val="1"/>
+      <w:numFmt w:val="decimal"/>
+      <w:lvlText w:val="%1.%2.%3.%4.%5.%6.%7.%8."/>
+      <w:lvlJc w:val="left"/>
+      <w:pPr>
+        <w:ind w:left="1800" w:hanging="1800"/>
+      </w:pPr>
+      <w:rPr>
+        <w:rFonts w:hint="default"/>
+      </w:rPr>
+    </w:lvl>
+    <w:lvl w:ilvl="8">
+      <w:start w:val="1"/>
+      <w:numFmt w:val="decimal"/>
+      <w:lvlText w:val="%1.%2.%3.%4.%5.%6.%7.%8.%9."/>
+      <w:lvlJc w:val="left"/>
+      <w:pPr>
+        <w:ind w:left="1800" w:hanging="1800"/>
+      </w:pPr>
+      <w:rPr>
+        <w:rFonts w:hint="default"/>
+      </w:rPr>
+    </w:lvl>
+  </w:abstractNum>
+  <w:abstractNum w:abstractNumId="5" w15:restartNumberingAfterBreak="0">
     <w:nsid w:val="5FF572B9"/>
     <w:multiLevelType w:val="hybridMultilevel"/>
     <w:tmpl w:val="400C862C"/>
@@ -1631,7 +2640,7 @@
       </w:pPr>
     </w:lvl>
   </w:abstractNum>
-  <w:abstractNum w:abstractNumId="4" w15:restartNumberingAfterBreak="0">
+  <w:abstractNum w:abstractNumId="6" w15:restartNumberingAfterBreak="0">
     <w:nsid w:val="71EF317D"/>
     <w:multiLevelType w:val="hybridMultilevel"/>
     <w:tmpl w:val="DB2A9D58"/>
@@ -1721,7 +2730,7 @@
     </w:lvl>
   </w:abstractNum>
   <w:num w:numId="1" w16cid:durableId="657266938">
-    <w:abstractNumId w:val="4"/>
+    <w:abstractNumId w:val="6"/>
   </w:num>
   <w:num w:numId="2" w16cid:durableId="808396926">
     <w:abstractNumId w:val="2"/>
@@ -1730,10 +2739,16 @@
     <w:abstractNumId w:val="1"/>
   </w:num>
   <w:num w:numId="4" w16cid:durableId="1363286322">
-    <w:abstractNumId w:val="3"/>
+    <w:abstractNumId w:val="5"/>
   </w:num>
   <w:num w:numId="5" w16cid:durableId="2127507588">
     <w:abstractNumId w:val="0"/>
+  </w:num>
+  <w:num w:numId="6" w16cid:durableId="1355809285">
+    <w:abstractNumId w:val="4"/>
+  </w:num>
+  <w:num w:numId="7" w16cid:durableId="128789750">
+    <w:abstractNumId w:val="3"/>
   </w:num>
 </w:numbering>
 </file>
@@ -2341,7 +3356,6 @@
   <w:style w:type="character" w:default="1" w:styleId="DefaultParagraphFont">
     <w:name w:val="Default Paragraph Font"/>
     <w:uiPriority w:val="1"/>
-    <w:semiHidden/>
     <w:unhideWhenUsed/>
   </w:style>
   <w:style w:type="table" w:default="1" w:styleId="TableNormal">

</xml_diff>

<commit_message>
feat: added notes and comments
</commit_message>
<xml_diff>
--- a/assets/Notes.docx
+++ b/assets/Notes.docx
@@ -1320,7 +1320,7 @@
         </w:numPr>
       </w:pPr>
       <w:r>
-        <w:t>Core Agents</w:t>
+        <w:t>Agents</w:t>
       </w:r>
       <w:r>
         <w:t>:</w:t>
@@ -2014,6 +2014,9 @@
           <w:numId w:val="7"/>
         </w:numPr>
       </w:pPr>
+      <w:r>
+        <w:t xml:space="preserve">Defining </w:t>
+      </w:r>
       <w:proofErr w:type="spellStart"/>
       <w:r>
         <w:t>PaymentReviewOrchestrator</w:t>
@@ -2043,6 +2046,9 @@
       <w:r>
         <w:t>() method</w:t>
       </w:r>
+      <w:r>
+        <w:t xml:space="preserve"> to start the crew instance</w:t>
+      </w:r>
     </w:p>
     <w:p>
       <w:pPr>
@@ -2100,10 +2106,33 @@
         <w:t xml:space="preserve">Prod: </w:t>
       </w:r>
       <w:r>
-        <w:t>Azure Service Bus for next steps in workflow, i.e. notifying Payment Officers, claim adjusters, etc</w:t>
+        <w:rPr>
+          <w:b/>
+          <w:bCs/>
+        </w:rPr>
+        <w:t>Azure Service Bus</w:t>
+      </w:r>
+      <w:r>
+        <w:t xml:space="preserve"> for next steps in workflow, i.e. notifying Payment Officers, claim adjusters, etc</w:t>
       </w:r>
       <w:r>
         <w:t>.</w:t>
+      </w:r>
+      <w:r>
+        <w:t xml:space="preserve"> (</w:t>
+      </w:r>
+      <w:r>
+        <w:t>…</w:t>
+      </w:r>
+      <w:r>
+        <w:t>depends on current architecture</w:t>
+      </w:r>
+      <w:r>
+        <w:rPr>
+          <w:i/>
+          <w:iCs/>
+        </w:rPr>
+        <w:t>)</w:t>
       </w:r>
     </w:p>
     <w:p/>
@@ -3432,6 +3461,7 @@
   <w:style w:type="character" w:default="1" w:styleId="DefaultParagraphFont">
     <w:name w:val="Default Paragraph Font"/>
     <w:uiPriority w:val="1"/>
+    <w:semiHidden/>
     <w:unhideWhenUsed/>
   </w:style>
   <w:style w:type="table" w:default="1" w:styleId="TableNormal">

</xml_diff>

<commit_message>
feat: added flowchart to Notes
</commit_message>
<xml_diff>
--- a/assets/Notes.docx
+++ b/assets/Notes.docx
@@ -593,10 +593,12 @@
         <w:t xml:space="preserve">i.e. </w:t>
       </w:r>
       <w:proofErr w:type="spellStart"/>
+      <w:proofErr w:type="gramStart"/>
       <w:r>
         <w:t>crew.kickoff</w:t>
       </w:r>
       <w:proofErr w:type="spellEnd"/>
+      <w:proofErr w:type="gramEnd"/>
       <w:r>
         <w:t>()</w:t>
       </w:r>
@@ -796,10 +798,12 @@
         <w:t xml:space="preserve"> uses </w:t>
       </w:r>
       <w:proofErr w:type="spellStart"/>
+      <w:proofErr w:type="gramStart"/>
       <w:r>
         <w:t>it’s</w:t>
       </w:r>
       <w:proofErr w:type="spellEnd"/>
+      <w:proofErr w:type="gramEnd"/>
       <w:r>
         <w:t xml:space="preserve"> own internal tools</w:t>
       </w:r>
@@ -1593,7 +1597,15 @@
         <w:t xml:space="preserve"> </w:t>
       </w:r>
       <w:r>
-        <w:t>either by email notification or task management system like JIRA.</w:t>
+        <w:t xml:space="preserve">either by </w:t>
+      </w:r>
+      <w:proofErr w:type="gramStart"/>
+      <w:r>
+        <w:t>email notification</w:t>
+      </w:r>
+      <w:proofErr w:type="gramEnd"/>
+      <w:r>
+        <w:t xml:space="preserve"> or task management system like JIRA.</w:t>
       </w:r>
       <w:r>
         <w:rPr>
@@ -2040,11 +2052,16 @@
       <w:r>
         <w:t xml:space="preserve">Holds the </w:t>
       </w:r>
+      <w:proofErr w:type="gramStart"/>
       <w:r>
         <w:t>kickoff</w:t>
       </w:r>
       <w:r>
-        <w:t>() method</w:t>
+        <w:t>(</w:t>
+      </w:r>
+      <w:proofErr w:type="gramEnd"/>
+      <w:r>
+        <w:t>) method</w:t>
       </w:r>
       <w:r>
         <w:t xml:space="preserve"> to start the crew instance</w:t>
@@ -2136,7 +2153,99 @@
       </w:r>
     </w:p>
     <w:p/>
-    <w:p/>
+    <w:p>
+      <w:pPr>
+        <w:pStyle w:val="ListParagraph"/>
+        <w:numPr>
+          <w:ilvl w:val="0"/>
+          <w:numId w:val="7"/>
+        </w:numPr>
+      </w:pPr>
+      <w:r>
+        <w:rPr>
+          <w:noProof/>
+        </w:rPr>
+        <w:lastRenderedPageBreak/>
+        <w:drawing>
+          <wp:anchor distT="0" distB="0" distL="114300" distR="114300" simplePos="0" relativeHeight="251666432" behindDoc="0" locked="0" layoutInCell="1" allowOverlap="1" wp14:anchorId="45313293" wp14:editId="5C09676C">
+            <wp:simplePos x="0" y="0"/>
+            <wp:positionH relativeFrom="margin">
+              <wp:align>left</wp:align>
+            </wp:positionH>
+            <wp:positionV relativeFrom="paragraph">
+              <wp:posOffset>229688</wp:posOffset>
+            </wp:positionV>
+            <wp:extent cx="6858000" cy="3824605"/>
+            <wp:effectExtent l="0" t="0" r="0" b="0"/>
+            <wp:wrapThrough wrapText="bothSides">
+              <wp:wrapPolygon edited="0">
+                <wp:start x="60" y="108"/>
+                <wp:lineTo x="60" y="21410"/>
+                <wp:lineTo x="21480" y="21410"/>
+                <wp:lineTo x="21540" y="753"/>
+                <wp:lineTo x="2460" y="108"/>
+                <wp:lineTo x="60" y="108"/>
+              </wp:wrapPolygon>
+            </wp:wrapThrough>
+            <wp:docPr id="614263534" name="Picture 1" descr="A screenshot of a computer&#10;&#10;AI-generated content may be incorrect."/>
+            <wp:cNvGraphicFramePr>
+              <a:graphicFrameLocks xmlns:a="http://schemas.openxmlformats.org/drawingml/2006/main" noChangeAspect="1"/>
+            </wp:cNvGraphicFramePr>
+            <a:graphic xmlns:a="http://schemas.openxmlformats.org/drawingml/2006/main">
+              <a:graphicData uri="http://schemas.openxmlformats.org/drawingml/2006/picture">
+                <pic:pic xmlns:pic="http://schemas.openxmlformats.org/drawingml/2006/picture">
+                  <pic:nvPicPr>
+                    <pic:cNvPr id="614263534" name="Picture 1" descr="A screenshot of a computer&#10;&#10;AI-generated content may be incorrect."/>
+                    <pic:cNvPicPr/>
+                  </pic:nvPicPr>
+                  <pic:blipFill>
+                    <a:blip r:embed="rId11" cstate="print">
+                      <a:extLst>
+                        <a:ext uri="{28A0092B-C50C-407E-A947-70E740481C1C}">
+                          <a14:useLocalDpi xmlns:a14="http://schemas.microsoft.com/office/drawing/2010/main" val="0"/>
+                        </a:ext>
+                      </a:extLst>
+                    </a:blip>
+                    <a:stretch>
+                      <a:fillRect/>
+                    </a:stretch>
+                  </pic:blipFill>
+                  <pic:spPr>
+                    <a:xfrm>
+                      <a:off x="0" y="0"/>
+                      <a:ext cx="6858000" cy="3824605"/>
+                    </a:xfrm>
+                    <a:prstGeom prst="rect">
+                      <a:avLst/>
+                    </a:prstGeom>
+                  </pic:spPr>
+                </pic:pic>
+              </a:graphicData>
+            </a:graphic>
+          </wp:anchor>
+        </w:drawing>
+      </w:r>
+      <w:r>
+        <w:t>Flowchart (</w:t>
+      </w:r>
+      <w:r>
+        <w:t>code</w:t>
+      </w:r>
+      <w:r>
+        <w:t>):</w:t>
+      </w:r>
+      <w:r>
+        <w:rPr>
+          <w:noProof/>
+        </w:rPr>
+        <w:t xml:space="preserve"> </w:t>
+      </w:r>
+    </w:p>
+    <w:p>
+      <w:pPr>
+        <w:pStyle w:val="ListParagraph"/>
+      </w:pPr>
+    </w:p>
     <w:p/>
     <w:p/>
     <w:p/>

</xml_diff>

<commit_message>
feat: added github link
</commit_message>
<xml_diff>
--- a/assets/Notes.docx
+++ b/assets/Notes.docx
@@ -2158,29 +2158,56 @@
         </w:numPr>
       </w:pPr>
       <w:r>
+        <w:lastRenderedPageBreak/>
+        <w:t>Flowchart (</w:t>
+      </w:r>
+      <w:r>
+        <w:t xml:space="preserve">&amp; </w:t>
+      </w:r>
+      <w:r>
+        <w:t>code</w:t>
+      </w:r>
+      <w:r>
+        <w:t xml:space="preserve"> link</w:t>
+      </w:r>
+      <w:r>
+        <w:t>):</w:t>
+      </w:r>
+      <w:r>
         <w:rPr>
           <w:noProof/>
         </w:rPr>
-        <w:lastRenderedPageBreak/>
+        <w:t xml:space="preserve"> </w:t>
+      </w:r>
+    </w:p>
+    <w:p>
+      <w:pPr>
+        <w:pStyle w:val="ListParagraph"/>
+      </w:pPr>
+      <w:r>
+        <w:rPr>
+          <w:noProof/>
+        </w:rPr>
         <w:drawing>
-          <wp:anchor distT="0" distB="0" distL="114300" distR="114300" simplePos="0" relativeHeight="251666432" behindDoc="0" locked="0" layoutInCell="1" allowOverlap="1" wp14:anchorId="7503C178" wp14:editId="2E23C237">
+          <wp:anchor distT="0" distB="0" distL="114300" distR="114300" simplePos="0" relativeHeight="251666432" behindDoc="0" locked="0" layoutInCell="1" allowOverlap="1" wp14:anchorId="7503C178" wp14:editId="35D160F0">
             <wp:simplePos x="0" y="0"/>
-            <wp:positionH relativeFrom="column">
-              <wp:posOffset>31901</wp:posOffset>
+            <wp:positionH relativeFrom="margin">
+              <wp:align>right</wp:align>
             </wp:positionH>
             <wp:positionV relativeFrom="paragraph">
-              <wp:posOffset>271871</wp:posOffset>
+              <wp:posOffset>344170</wp:posOffset>
             </wp:positionV>
             <wp:extent cx="6858000" cy="3824605"/>
-            <wp:effectExtent l="0" t="0" r="0" b="0"/>
+            <wp:effectExtent l="0" t="0" r="0" b="4445"/>
             <wp:wrapThrough wrapText="bothSides">
               <wp:wrapPolygon edited="0">
-                <wp:start x="60" y="108"/>
-                <wp:lineTo x="60" y="21410"/>
-                <wp:lineTo x="21480" y="21410"/>
+                <wp:start x="120" y="0"/>
+                <wp:lineTo x="0" y="1937"/>
+                <wp:lineTo x="60" y="21518"/>
+                <wp:lineTo x="21480" y="21518"/>
                 <wp:lineTo x="21540" y="753"/>
-                <wp:lineTo x="2460" y="108"/>
-                <wp:lineTo x="60" y="108"/>
+                <wp:lineTo x="2400" y="0"/>
+                <wp:lineTo x="120" y="0"/>
               </wp:wrapPolygon>
             </wp:wrapThrough>
             <wp:docPr id="584113993" name="Picture 1" descr="A screenshot of a computer&#10;&#10;AI-generated content may be incorrect."/>
@@ -2222,25 +2249,11 @@
         </w:drawing>
       </w:r>
       <w:r>
-        <w:t>Flowchart (</w:t>
-      </w:r>
-      <w:r>
-        <w:t>code</w:t>
-      </w:r>
-      <w:r>
-        <w:t>):</w:t>
-      </w:r>
-      <w:r>
-        <w:rPr>
-          <w:noProof/>
-        </w:rPr>
-        <w:t xml:space="preserve"> </w:t>
-      </w:r>
-    </w:p>
-    <w:p>
-      <w:pPr>
-        <w:pStyle w:val="ListParagraph"/>
-      </w:pPr>
+        <w:rPr>
+          <w:highlight w:val="yellow"/>
+        </w:rPr>
+        <w:t>https://github.com/Zahidd02/worksafebc_scenario_challenge</w:t>
+      </w:r>
     </w:p>
     <w:p/>
     <w:p/>

</xml_diff>

<commit_message>
feat: added new note and a README change
</commit_message>
<xml_diff>
--- a/assets/Notes.docx
+++ b/assets/Notes.docx
@@ -206,7 +206,13 @@
         <w:t>1M</w:t>
       </w:r>
       <w:r>
-        <w:t xml:space="preserve"> tokens (custom rate </w:t>
+        <w:t xml:space="preserve"> tokens</w:t>
+      </w:r>
+      <w:r>
+        <w:t xml:space="preserve"> context window</w:t>
+      </w:r>
+      <w:r>
+        <w:t xml:space="preserve"> (custom rate </w:t>
       </w:r>
       <w:r>
         <w:t>or Tier 4</w:t>
@@ -391,10 +397,26 @@
     </w:p>
     <w:p>
       <w:pPr>
+        <w:pStyle w:val="Heading1"/>
+        <w:rPr>
+          <w:sz w:val="28"/>
+          <w:szCs w:val="28"/>
+        </w:rPr>
+      </w:pPr>
+      <w:r>
+        <w:rPr>
+          <w:sz w:val="28"/>
+          <w:szCs w:val="28"/>
+        </w:rPr>
+        <w:t>Risk Mitigation</w:t>
+      </w:r>
+    </w:p>
+    <w:p>
+      <w:pPr>
         <w:pStyle w:val="ListParagraph"/>
         <w:numPr>
           <w:ilvl w:val="0"/>
-          <w:numId w:val="2"/>
+          <w:numId w:val="9"/>
         </w:numPr>
       </w:pPr>
       <w:bookmarkStart w:id="0" w:name="_Hlk213057716"/>
@@ -471,7 +493,177 @@
     <w:p/>
     <w:p/>
     <w:p/>
-    <w:p/>
+    <w:p>
+      <w:pPr>
+        <w:tabs>
+          <w:tab w:val="left" w:pos="9196"/>
+        </w:tabs>
+      </w:pPr>
+      <w:r>
+        <w:tab/>
+      </w:r>
+    </w:p>
+    <w:p>
+      <w:pPr>
+        <w:pStyle w:val="ListParagraph"/>
+        <w:numPr>
+          <w:ilvl w:val="0"/>
+          <w:numId w:val="9"/>
+        </w:numPr>
+        <w:tabs>
+          <w:tab w:val="left" w:pos="9196"/>
+        </w:tabs>
+      </w:pPr>
+      <w:r>
+        <w:t>All services created within the Resource Group for this project will use Canadian servers only. This includes</w:t>
+      </w:r>
+      <w:r>
+        <w:t>:</w:t>
+      </w:r>
+    </w:p>
+    <w:p>
+      <w:pPr>
+        <w:pStyle w:val="ListParagraph"/>
+        <w:numPr>
+          <w:ilvl w:val="1"/>
+          <w:numId w:val="9"/>
+        </w:numPr>
+        <w:tabs>
+          <w:tab w:val="left" w:pos="9196"/>
+        </w:tabs>
+        <w:rPr>
+          <w:lang w:val="es-ES"/>
+        </w:rPr>
+      </w:pPr>
+      <w:proofErr w:type="spellStart"/>
+      <w:r>
+        <w:rPr>
+          <w:b/>
+          <w:bCs/>
+          <w:lang w:val="es-ES"/>
+        </w:rPr>
+        <w:t>Canada</w:t>
+      </w:r>
+      <w:proofErr w:type="spellEnd"/>
+      <w:r>
+        <w:rPr>
+          <w:b/>
+          <w:bCs/>
+          <w:lang w:val="es-ES"/>
+        </w:rPr>
+        <w:t xml:space="preserve"> Central</w:t>
+      </w:r>
+      <w:r>
+        <w:rPr>
+          <w:lang w:val="es-ES"/>
+        </w:rPr>
+        <w:t xml:space="preserve"> (</w:t>
+      </w:r>
+      <w:proofErr w:type="spellStart"/>
+      <w:r>
+        <w:rPr>
+          <w:lang w:val="es-ES"/>
+        </w:rPr>
+        <w:t>region</w:t>
+      </w:r>
+      <w:proofErr w:type="spellEnd"/>
+      <w:r>
+        <w:rPr>
+          <w:lang w:val="es-ES"/>
+        </w:rPr>
+        <w:t xml:space="preserve"> </w:t>
+      </w:r>
+      <w:proofErr w:type="spellStart"/>
+      <w:r>
+        <w:rPr>
+          <w:lang w:val="es-ES"/>
+        </w:rPr>
+        <w:t>code</w:t>
+      </w:r>
+      <w:proofErr w:type="spellEnd"/>
+      <w:r>
+        <w:rPr>
+          <w:lang w:val="es-ES"/>
+        </w:rPr>
+        <w:t xml:space="preserve">: </w:t>
+      </w:r>
+      <w:proofErr w:type="spellStart"/>
+      <w:r>
+        <w:rPr>
+          <w:i/>
+          <w:iCs/>
+          <w:lang w:val="es-ES"/>
+        </w:rPr>
+        <w:t>canadacentral</w:t>
+      </w:r>
+      <w:proofErr w:type="spellEnd"/>
+      <w:r>
+        <w:rPr>
+          <w:lang w:val="es-ES"/>
+        </w:rPr>
+        <w:t xml:space="preserve">) – </w:t>
+      </w:r>
+      <w:proofErr w:type="spellStart"/>
+      <w:r>
+        <w:rPr>
+          <w:lang w:val="es-ES"/>
+        </w:rPr>
+        <w:t>located</w:t>
+      </w:r>
+      <w:proofErr w:type="spellEnd"/>
+      <w:r>
+        <w:rPr>
+          <w:lang w:val="es-ES"/>
+        </w:rPr>
+        <w:t xml:space="preserve"> </w:t>
+      </w:r>
+      <w:r>
+        <w:rPr>
+          <w:lang w:val="es-ES"/>
+        </w:rPr>
+        <w:t xml:space="preserve">in </w:t>
+      </w:r>
+      <w:r>
+        <w:rPr>
+          <w:lang w:val="es-ES"/>
+        </w:rPr>
+        <w:t>Toronto, Ontario</w:t>
+      </w:r>
+    </w:p>
+    <w:p>
+      <w:pPr>
+        <w:pStyle w:val="ListParagraph"/>
+        <w:numPr>
+          <w:ilvl w:val="1"/>
+          <w:numId w:val="9"/>
+        </w:numPr>
+        <w:tabs>
+          <w:tab w:val="left" w:pos="9196"/>
+        </w:tabs>
+      </w:pPr>
+      <w:r>
+        <w:rPr>
+          <w:b/>
+          <w:bCs/>
+        </w:rPr>
+        <w:t>Canada East</w:t>
+      </w:r>
+      <w:r>
+        <w:t xml:space="preserve"> (region code: </w:t>
+      </w:r>
+      <w:proofErr w:type="spellStart"/>
+      <w:r>
+        <w:rPr>
+          <w:i/>
+          <w:iCs/>
+        </w:rPr>
+        <w:t>canadaeast</w:t>
+      </w:r>
+      <w:proofErr w:type="spellEnd"/>
+      <w:r>
+        <w:t>) — located in Quebec</w:t>
+      </w:r>
+    </w:p>
     <w:p>
       <w:pPr>
         <w:pStyle w:val="Heading1"/>
@@ -614,6 +806,7 @@
         </w:numPr>
       </w:pPr>
       <w:r>
+        <w:lastRenderedPageBreak/>
         <w:t xml:space="preserve">Debugging </w:t>
       </w:r>
       <w:r>
@@ -753,7 +946,6 @@
         </w:numPr>
       </w:pPr>
       <w:r>
-        <w:lastRenderedPageBreak/>
         <w:t xml:space="preserve">Code might get complicated and hard to understand as </w:t>
       </w:r>
       <w:proofErr w:type="spellStart"/>
@@ -1357,6 +1549,7 @@
         <w:ind w:left="1440"/>
       </w:pPr>
       <w:r>
+        <w:lastRenderedPageBreak/>
         <w:t xml:space="preserve">This agent will be responsible for </w:t>
       </w:r>
       <w:r>
@@ -1471,7 +1664,6 @@
         <w:ind w:left="1440"/>
       </w:pPr>
       <w:r>
-        <w:lastRenderedPageBreak/>
         <w:t>E</w:t>
       </w:r>
       <w:r>
@@ -2078,6 +2270,7 @@
         </w:numPr>
       </w:pPr>
       <w:r>
+        <w:lastRenderedPageBreak/>
         <w:t xml:space="preserve">Output is then analyzed </w:t>
       </w:r>
       <w:r>
@@ -2160,7 +2353,6 @@
         </w:numPr>
       </w:pPr>
       <w:r>
-        <w:lastRenderedPageBreak/>
         <w:t>Flowchart (</w:t>
       </w:r>
       <w:r>
@@ -2321,13 +2513,7 @@
           <w:rPr>
             <w:rStyle w:val="Hyperlink"/>
           </w:rPr>
-          <w:t>https://privacy.claude.com/en/articles/7996868-is-my-data-used-for-model-trainin</w:t>
-        </w:r>
-        <w:r>
-          <w:rPr>
-            <w:rStyle w:val="Hyperlink"/>
-          </w:rPr>
-          <w:t>g</w:t>
+          <w:t>https://privacy.claude.com/en/articles/7996868-is-my-data-used-for-model-training</w:t>
         </w:r>
       </w:hyperlink>
     </w:p>
@@ -2744,6 +2930,98 @@
     </w:lvl>
   </w:abstractNum>
   <w:abstractNum w:abstractNumId="4" w15:restartNumberingAfterBreak="0">
+    <w:nsid w:val="4A611CD1"/>
+    <w:multiLevelType w:val="hybridMultilevel"/>
+    <w:tmpl w:val="6F3E1C86"/>
+    <w:lvl w:ilvl="0" w:tplc="0409000F">
+      <w:start w:val="1"/>
+      <w:numFmt w:val="decimal"/>
+      <w:lvlText w:val="%1."/>
+      <w:lvlJc w:val="left"/>
+      <w:pPr>
+        <w:ind w:left="720" w:hanging="360"/>
+      </w:pPr>
+      <w:rPr>
+        <w:rFonts w:hint="default"/>
+      </w:rPr>
+    </w:lvl>
+    <w:lvl w:ilvl="1" w:tplc="04090001">
+      <w:start w:val="1"/>
+      <w:numFmt w:val="bullet"/>
+      <w:lvlText w:val=""/>
+      <w:lvlJc w:val="left"/>
+      <w:pPr>
+        <w:ind w:left="1440" w:hanging="360"/>
+      </w:pPr>
+      <w:rPr>
+        <w:rFonts w:ascii="Symbol" w:hAnsi="Symbol" w:hint="default"/>
+      </w:rPr>
+    </w:lvl>
+    <w:lvl w:ilvl="2" w:tplc="0409001B" w:tentative="1">
+      <w:start w:val="1"/>
+      <w:numFmt w:val="lowerRoman"/>
+      <w:lvlText w:val="%3."/>
+      <w:lvlJc w:val="right"/>
+      <w:pPr>
+        <w:ind w:left="2160" w:hanging="180"/>
+      </w:pPr>
+    </w:lvl>
+    <w:lvl w:ilvl="3" w:tplc="0409000F" w:tentative="1">
+      <w:start w:val="1"/>
+      <w:numFmt w:val="decimal"/>
+      <w:lvlText w:val="%4."/>
+      <w:lvlJc w:val="left"/>
+      <w:pPr>
+        <w:ind w:left="2880" w:hanging="360"/>
+      </w:pPr>
+    </w:lvl>
+    <w:lvl w:ilvl="4" w:tplc="04090019" w:tentative="1">
+      <w:start w:val="1"/>
+      <w:numFmt w:val="lowerLetter"/>
+      <w:lvlText w:val="%5."/>
+      <w:lvlJc w:val="left"/>
+      <w:pPr>
+        <w:ind w:left="3600" w:hanging="360"/>
+      </w:pPr>
+    </w:lvl>
+    <w:lvl w:ilvl="5" w:tplc="0409001B" w:tentative="1">
+      <w:start w:val="1"/>
+      <w:numFmt w:val="lowerRoman"/>
+      <w:lvlText w:val="%6."/>
+      <w:lvlJc w:val="right"/>
+      <w:pPr>
+        <w:ind w:left="4320" w:hanging="180"/>
+      </w:pPr>
+    </w:lvl>
+    <w:lvl w:ilvl="6" w:tplc="0409000F" w:tentative="1">
+      <w:start w:val="1"/>
+      <w:numFmt w:val="decimal"/>
+      <w:lvlText w:val="%7."/>
+      <w:lvlJc w:val="left"/>
+      <w:pPr>
+        <w:ind w:left="5040" w:hanging="360"/>
+      </w:pPr>
+    </w:lvl>
+    <w:lvl w:ilvl="7" w:tplc="04090019" w:tentative="1">
+      <w:start w:val="1"/>
+      <w:numFmt w:val="lowerLetter"/>
+      <w:lvlText w:val="%8."/>
+      <w:lvlJc w:val="left"/>
+      <w:pPr>
+        <w:ind w:left="5760" w:hanging="360"/>
+      </w:pPr>
+    </w:lvl>
+    <w:lvl w:ilvl="8" w:tplc="0409001B" w:tentative="1">
+      <w:start w:val="1"/>
+      <w:numFmt w:val="lowerRoman"/>
+      <w:lvlText w:val="%9."/>
+      <w:lvlJc w:val="right"/>
+      <w:pPr>
+        <w:ind w:left="6480" w:hanging="180"/>
+      </w:pPr>
+    </w:lvl>
+  </w:abstractNum>
+  <w:abstractNum w:abstractNumId="5" w15:restartNumberingAfterBreak="0">
     <w:nsid w:val="576D271E"/>
     <w:multiLevelType w:val="hybridMultilevel"/>
     <w:tmpl w:val="E236D532"/>
@@ -2856,7 +3134,7 @@
       </w:rPr>
     </w:lvl>
   </w:abstractNum>
-  <w:abstractNum w:abstractNumId="5" w15:restartNumberingAfterBreak="0">
+  <w:abstractNum w:abstractNumId="6" w15:restartNumberingAfterBreak="0">
     <w:nsid w:val="5A3437EB"/>
     <w:multiLevelType w:val="multilevel"/>
     <w:tmpl w:val="E1A61840"/>
@@ -2969,7 +3247,7 @@
       </w:rPr>
     </w:lvl>
   </w:abstractNum>
-  <w:abstractNum w:abstractNumId="6" w15:restartNumberingAfterBreak="0">
+  <w:abstractNum w:abstractNumId="7" w15:restartNumberingAfterBreak="0">
     <w:nsid w:val="5FF572B9"/>
     <w:multiLevelType w:val="hybridMultilevel"/>
     <w:tmpl w:val="400C862C"/>
@@ -3061,7 +3339,7 @@
       </w:pPr>
     </w:lvl>
   </w:abstractNum>
-  <w:abstractNum w:abstractNumId="7" w15:restartNumberingAfterBreak="0">
+  <w:abstractNum w:abstractNumId="8" w15:restartNumberingAfterBreak="0">
     <w:nsid w:val="71EF317D"/>
     <w:multiLevelType w:val="hybridMultilevel"/>
     <w:tmpl w:val="DB2A9D58"/>
@@ -3151,7 +3429,7 @@
     </w:lvl>
   </w:abstractNum>
   <w:num w:numId="1" w16cid:durableId="657266938">
-    <w:abstractNumId w:val="7"/>
+    <w:abstractNumId w:val="8"/>
   </w:num>
   <w:num w:numId="2" w16cid:durableId="808396926">
     <w:abstractNumId w:val="2"/>
@@ -3160,18 +3438,21 @@
     <w:abstractNumId w:val="1"/>
   </w:num>
   <w:num w:numId="4" w16cid:durableId="1363286322">
-    <w:abstractNumId w:val="6"/>
+    <w:abstractNumId w:val="7"/>
   </w:num>
   <w:num w:numId="5" w16cid:durableId="2127507588">
     <w:abstractNumId w:val="0"/>
   </w:num>
   <w:num w:numId="6" w16cid:durableId="1355809285">
-    <w:abstractNumId w:val="5"/>
+    <w:abstractNumId w:val="6"/>
   </w:num>
   <w:num w:numId="7" w16cid:durableId="128789750">
     <w:abstractNumId w:val="3"/>
   </w:num>
   <w:num w:numId="8" w16cid:durableId="680746082">
+    <w:abstractNumId w:val="5"/>
+  </w:num>
+  <w:num w:numId="9" w16cid:durableId="888303879">
     <w:abstractNumId w:val="4"/>
   </w:num>
 </w:numbering>
@@ -3780,7 +4061,6 @@
   <w:style w:type="character" w:default="1" w:styleId="DefaultParagraphFont">
     <w:name w:val="Default Paragraph Font"/>
     <w:uiPriority w:val="1"/>
-    <w:semiHidden/>
     <w:unhideWhenUsed/>
   </w:style>
   <w:style w:type="table" w:default="1" w:styleId="TableNormal">

</xml_diff>